<commit_message>
feat: add mermaid diagram support for PDF and DOCX output
Mermaid code blocks (```mermaid) now render as visual diagrams instead
of plain code text. PDF uses client-side rendering via mermaid.js
injected into Puppeteer; DOCX pre-renders diagrams to PNG via a
headless browser and embeds them as images. Forces light color scheme
in Puppeteer to prevent dark mode from affecting diagram backgrounds.

Co-Authored-By: Claude Opus 4.6 (1M context) <noreply@anthropic.com>
</commit_message>
<xml_diff>
--- a/test/output/fixture.docx
+++ b/test/output/fixture.docx
@@ -57,7 +57,7 @@
         </w:rPr>
         <w:t xml:space="preserve">	</w:t>
       </w:r>
-      <w:hyperlink w:history="1" r:id="rId5or0l_z9vedykqkuxvcvn">
+      <w:hyperlink w:history="1" r:id="rIdlfu-cg8d7n8ula4cpuibt">
         <w:r>
           <w:rPr>
             <w:rFonts w:ascii="Roboto" w:cs="Roboto" w:eastAsia="Roboto" w:hAnsi="Roboto"/>
@@ -74,7 +74,7 @@
         <w:spacing w:after="400"/>
         <w:jc w:val="right"/>
       </w:pPr>
-      <w:hyperlink w:history="1" r:id="rIdfacn5_yzp7ljzgvvoqbwf">
+      <w:hyperlink w:history="1" r:id="rIddtsjtosuotm6vneguaxsm">
         <w:r>
           <w:rPr>
             <w:rFonts w:ascii="Roboto" w:cs="Roboto" w:eastAsia="Roboto" w:hAnsi="Roboto"/>
@@ -957,7 +957,7 @@
         </w:rPr>
         <w:t xml:space="preserve"> and a </w:t>
       </w:r>
-      <w:hyperlink w:history="1" r:id="rIdfsi9owkxrrrg0c0nggwd6">
+      <w:hyperlink w:history="1" r:id="rIdvabcwvxsk6sawijqo9o-2">
         <w:r>
           <w:rPr>
             <w:rFonts w:ascii="Roboto" w:cs="Roboto" w:eastAsia="Roboto" w:hAnsi="Roboto"/>
@@ -2286,7 +2286,7 @@
               </w:rPr>
               <w:t xml:space="preserve">See </w:t>
             </w:r>
-            <w:hyperlink w:history="1" r:id="rIdjep0n-bq7bzn-meahsrlv">
+            <w:hyperlink w:history="1" r:id="rIdovcahfjqnsnjazd75og2w">
               <w:r>
                 <w:rPr>
                   <w:rFonts w:ascii="Roboto" w:cs="Roboto" w:eastAsia="Roboto" w:hAnsi="Roboto"/>
@@ -3357,51 +3357,159 @@
           <w:sz w:val="26"/>
           <w:szCs w:val="26"/>
         </w:rPr>
-        <w:t xml:space="preserve">Horizontal Rules</w:t>
-      </w:r>
-    </w:p>
-    <w:p>
-      <w:pPr>
-        <w:spacing w:after="120" w:line="360"/>
-      </w:pPr>
-      <w:r>
-        <w:rPr>
-          <w:rFonts w:ascii="Roboto" w:cs="Roboto" w:eastAsia="Roboto" w:hAnsi="Roboto"/>
-          <w:b w:val="false"/>
-          <w:bCs w:val="false"/>
-          <w:i w:val="false"/>
-          <w:iCs w:val="false"/>
-          <w:color w:val="353744"/>
-          <w:sz w:val="20"/>
-          <w:szCs w:val="20"/>
-        </w:rPr>
-        <w:t xml:space="preserve">Content above the rule.</w:t>
-      </w:r>
-    </w:p>
-    <w:p>
-      <w:pPr>
-        <w:pBdr>
-          <w:bottom w:val="single" w:color="BFBFBF" w:sz="4"/>
-        </w:pBdr>
-        <w:spacing w:after="200" w:before="200"/>
-      </w:pPr>
-    </w:p>
-    <w:p>
-      <w:pPr>
-        <w:spacing w:after="120" w:line="360"/>
-      </w:pPr>
-      <w:r>
-        <w:rPr>
-          <w:rFonts w:ascii="Roboto" w:cs="Roboto" w:eastAsia="Roboto" w:hAnsi="Roboto"/>
-          <w:b w:val="false"/>
-          <w:bCs w:val="false"/>
-          <w:i w:val="false"/>
-          <w:iCs w:val="false"/>
-          <w:color w:val="353744"/>
-          <w:sz w:val="20"/>
-          <w:szCs w:val="20"/>
-        </w:rPr>
-        <w:t xml:space="preserve">Content below the rule.</w:t>
+        <w:t xml:space="preserve">Mermaid Diagrams</w:t>
+      </w:r>
+    </w:p>
+    <w:p>
+      <w:pPr>
+        <w:pStyle w:val="Heading3"/>
+        <w:spacing w:after="120" w:before="200"/>
+      </w:pPr>
+      <w:r>
+        <w:rPr>
+          <w:rFonts w:ascii="Roboto" w:cs="Roboto" w:eastAsia="Roboto" w:hAnsi="Roboto"/>
+          <w:b/>
+          <w:bCs/>
+          <w:color w:val="058775"/>
+          <w:sz w:val="24"/>
+          <w:szCs w:val="24"/>
+        </w:rPr>
+        <w:t xml:space="preserve">8.1 </w:t>
+      </w:r>
+      <w:r>
+        <w:rPr>
+          <w:rFonts w:ascii="Roboto" w:cs="Roboto" w:eastAsia="Roboto" w:hAnsi="Roboto"/>
+          <w:b/>
+          <w:bCs/>
+          <w:i w:val="false"/>
+          <w:iCs w:val="false"/>
+          <w:color w:val="058775"/>
+          <w:sz w:val="24"/>
+          <w:szCs w:val="24"/>
+        </w:rPr>
+        <w:t xml:space="preserve">Flowchart</w:t>
+      </w:r>
+    </w:p>
+    <w:p>
+      <w:pPr>
+        <w:spacing w:after="120" w:before="120"/>
+        <w:jc w:val="center"/>
+      </w:pPr>
+      <w:r>
+        <w:drawing>
+          <wp:inline distT="0" distB="0" distL="0" distR="0">
+            <wp:extent cx="3067050" cy="3438525"/>
+            <wp:effectExtent t="0" r="0" b="0" l="0"/>
+            <wp:docPr id="1" name="" descr="" title=""/>
+            <wp:cNvGraphicFramePr>
+              <a:graphicFrameLocks xmlns:a="http://schemas.openxmlformats.org/drawingml/2006/main" noChangeAspect="1"/>
+            </wp:cNvGraphicFramePr>
+            <a:graphic xmlns:a="http://schemas.openxmlformats.org/drawingml/2006/main">
+              <a:graphicData uri="http://schemas.openxmlformats.org/drawingml/2006/picture">
+                <pic:pic xmlns:pic="http://schemas.openxmlformats.org/drawingml/2006/picture">
+                  <pic:nvPicPr>
+                    <pic:cNvPr id="0" name="" descr=""/>
+                    <pic:cNvPicPr>
+                      <a:picLocks noChangeAspect="1" noChangeArrowheads="1"/>
+                    </pic:cNvPicPr>
+                  </pic:nvPicPr>
+                  <pic:blipFill>
+                    <a:blip r:embed="rId12" cstate="none"/>
+                    <a:srcRect/>
+                    <a:stretch>
+                      <a:fillRect/>
+                    </a:stretch>
+                  </pic:blipFill>
+                  <pic:spPr bwMode="auto">
+                    <a:xfrm>
+                      <a:off x="0" y="0"/>
+                      <a:ext cx="3067050" cy="3438525"/>
+                    </a:xfrm>
+                    <a:prstGeom prst="rect">
+                      <a:avLst/>
+                    </a:prstGeom>
+                  </pic:spPr>
+                </pic:pic>
+              </a:graphicData>
+            </a:graphic>
+          </wp:inline>
+        </w:drawing>
+      </w:r>
+    </w:p>
+    <w:p>
+      <w:pPr>
+        <w:pStyle w:val="Heading3"/>
+        <w:spacing w:after="120" w:before="200"/>
+      </w:pPr>
+      <w:r>
+        <w:rPr>
+          <w:rFonts w:ascii="Roboto" w:cs="Roboto" w:eastAsia="Roboto" w:hAnsi="Roboto"/>
+          <w:b/>
+          <w:bCs/>
+          <w:color w:val="058775"/>
+          <w:sz w:val="24"/>
+          <w:szCs w:val="24"/>
+        </w:rPr>
+        <w:t xml:space="preserve">8.2 </w:t>
+      </w:r>
+      <w:r>
+        <w:rPr>
+          <w:rFonts w:ascii="Roboto" w:cs="Roboto" w:eastAsia="Roboto" w:hAnsi="Roboto"/>
+          <w:b/>
+          <w:bCs/>
+          <w:i w:val="false"/>
+          <w:iCs w:val="false"/>
+          <w:color w:val="058775"/>
+          <w:sz w:val="24"/>
+          <w:szCs w:val="24"/>
+        </w:rPr>
+        <w:t xml:space="preserve">Sequence Diagram</w:t>
+      </w:r>
+    </w:p>
+    <w:p>
+      <w:pPr>
+        <w:spacing w:after="120" w:before="120"/>
+        <w:jc w:val="center"/>
+      </w:pPr>
+      <w:r>
+        <w:drawing>
+          <wp:inline distT="0" distB="0" distL="0" distR="0">
+            <wp:extent cx="4762500" cy="2419350"/>
+            <wp:effectExtent t="0" r="0" b="0" l="0"/>
+            <wp:docPr id="1" name="" descr="" title=""/>
+            <wp:cNvGraphicFramePr>
+              <a:graphicFrameLocks xmlns:a="http://schemas.openxmlformats.org/drawingml/2006/main" noChangeAspect="1"/>
+            </wp:cNvGraphicFramePr>
+            <a:graphic xmlns:a="http://schemas.openxmlformats.org/drawingml/2006/main">
+              <a:graphicData uri="http://schemas.openxmlformats.org/drawingml/2006/picture">
+                <pic:pic xmlns:pic="http://schemas.openxmlformats.org/drawingml/2006/picture">
+                  <pic:nvPicPr>
+                    <pic:cNvPr id="0" name="" descr=""/>
+                    <pic:cNvPicPr>
+                      <a:picLocks noChangeAspect="1" noChangeArrowheads="1"/>
+                    </pic:cNvPicPr>
+                  </pic:nvPicPr>
+                  <pic:blipFill>
+                    <a:blip r:embed="rId13" cstate="none"/>
+                    <a:srcRect/>
+                    <a:stretch>
+                      <a:fillRect/>
+                    </a:stretch>
+                  </pic:blipFill>
+                  <pic:spPr bwMode="auto">
+                    <a:xfrm>
+                      <a:off x="0" y="0"/>
+                      <a:ext cx="4762500" cy="2419350"/>
+                    </a:xfrm>
+                    <a:prstGeom prst="rect">
+                      <a:avLst/>
+                    </a:prstGeom>
+                  </pic:spPr>
+                </pic:pic>
+              </a:graphicData>
+            </a:graphic>
+          </wp:inline>
+        </w:drawing>
       </w:r>
     </w:p>
     <w:p>
@@ -3434,37 +3542,7 @@
           <w:sz w:val="26"/>
           <w:szCs w:val="26"/>
         </w:rPr>
-        <w:t xml:space="preserve">Headings Hierarchy</w:t>
-      </w:r>
-    </w:p>
-    <w:p>
-      <w:pPr>
-        <w:pStyle w:val="Heading3"/>
-        <w:spacing w:after="120" w:before="200"/>
-      </w:pPr>
-      <w:r>
-        <w:rPr>
-          <w:rFonts w:ascii="Roboto" w:cs="Roboto" w:eastAsia="Roboto" w:hAnsi="Roboto"/>
-          <w:b/>
-          <w:bCs/>
-          <w:color w:val="058775"/>
-          <w:sz w:val="24"/>
-          <w:szCs w:val="24"/>
-        </w:rPr>
-        <w:t xml:space="preserve">9.1 </w:t>
-      </w:r>
-      <w:r>
-        <w:rPr>
-          <w:rFonts w:ascii="Roboto" w:cs="Roboto" w:eastAsia="Roboto" w:hAnsi="Roboto"/>
-          <w:b/>
-          <w:bCs/>
-          <w:i w:val="false"/>
-          <w:iCs w:val="false"/>
-          <w:color w:val="058775"/>
-          <w:sz w:val="24"/>
-          <w:szCs w:val="24"/>
-        </w:rPr>
-        <w:t xml:space="preserve">Third-Level Heading (H3)</w:t>
+        <w:t xml:space="preserve">Horizontal Rules</w:t>
       </w:r>
     </w:p>
     <w:p>
@@ -3482,38 +3560,16 @@
           <w:sz w:val="20"/>
           <w:szCs w:val="20"/>
         </w:rPr>
-        <w:t xml:space="preserve">Content under H3 to verify green color and section numbering.</w:t>
-      </w:r>
-    </w:p>
-    <w:p>
-      <w:pPr>
-        <w:pStyle w:val="Heading4"/>
-        <w:spacing w:after="120" w:before="200"/>
-      </w:pPr>
-      <w:r>
-        <w:rPr>
-          <w:rFonts w:ascii="Roboto" w:cs="Roboto" w:eastAsia="Roboto" w:hAnsi="Roboto"/>
-          <w:b/>
-          <w:bCs/>
-          <w:color w:val="272727"/>
-          <w:sz w:val="22"/>
-          <w:szCs w:val="22"/>
-        </w:rPr>
-        <w:t xml:space="preserve">9.1.1 </w:t>
-      </w:r>
-      <w:r>
-        <w:rPr>
-          <w:rFonts w:ascii="Roboto" w:cs="Roboto" w:eastAsia="Roboto" w:hAnsi="Roboto"/>
-          <w:b/>
-          <w:bCs/>
-          <w:i w:val="false"/>
-          <w:iCs w:val="false"/>
-          <w:color w:val="272727"/>
-          <w:sz w:val="22"/>
-          <w:szCs w:val="22"/>
-        </w:rPr>
-        <w:t xml:space="preserve">Fourth-Level Heading (H4)</w:t>
-      </w:r>
+        <w:t xml:space="preserve">Content above the rule.</w:t>
+      </w:r>
+    </w:p>
+    <w:p>
+      <w:pPr>
+        <w:pBdr>
+          <w:bottom w:val="single" w:color="BFBFBF" w:sz="4"/>
+        </w:pBdr>
+        <w:spacing w:after="200" w:before="200"/>
+      </w:pPr>
     </w:p>
     <w:p>
       <w:pPr>
@@ -3530,55 +3586,7 @@
           <w:sz w:val="20"/>
           <w:szCs w:val="20"/>
         </w:rPr>
-        <w:t xml:space="preserve">Content under H4 to verify dark2 color and deeper numbering (e.g. 7.1.1).</w:t>
-      </w:r>
-    </w:p>
-    <w:p>
-      <w:pPr>
-        <w:pStyle w:val="Heading3"/>
-        <w:spacing w:after="120" w:before="200"/>
-      </w:pPr>
-      <w:r>
-        <w:rPr>
-          <w:rFonts w:ascii="Roboto" w:cs="Roboto" w:eastAsia="Roboto" w:hAnsi="Roboto"/>
-          <w:b/>
-          <w:bCs/>
-          <w:color w:val="058775"/>
-          <w:sz w:val="24"/>
-          <w:szCs w:val="24"/>
-        </w:rPr>
-        <w:t xml:space="preserve">9.2 </w:t>
-      </w:r>
-      <w:r>
-        <w:rPr>
-          <w:rFonts w:ascii="Roboto" w:cs="Roboto" w:eastAsia="Roboto" w:hAnsi="Roboto"/>
-          <w:b/>
-          <w:bCs/>
-          <w:i w:val="false"/>
-          <w:iCs w:val="false"/>
-          <w:color w:val="058775"/>
-          <w:sz w:val="24"/>
-          <w:szCs w:val="24"/>
-        </w:rPr>
-        <w:t xml:space="preserve">Another H3</w:t>
-      </w:r>
-    </w:p>
-    <w:p>
-      <w:pPr>
-        <w:spacing w:after="120" w:line="360"/>
-      </w:pPr>
-      <w:r>
-        <w:rPr>
-          <w:rFonts w:ascii="Roboto" w:cs="Roboto" w:eastAsia="Roboto" w:hAnsi="Roboto"/>
-          <w:b w:val="false"/>
-          <w:bCs w:val="false"/>
-          <w:i w:val="false"/>
-          <w:iCs w:val="false"/>
-          <w:color w:val="353744"/>
-          <w:sz w:val="20"/>
-          <w:szCs w:val="20"/>
-        </w:rPr>
-        <w:t xml:space="preserve">Back to H3 to verify counter resets properly.</w:t>
+        <w:t xml:space="preserve">Content below the rule.</w:t>
       </w:r>
     </w:p>
     <w:p>
@@ -3611,7 +3619,7 @@
           <w:sz w:val="26"/>
           <w:szCs w:val="26"/>
         </w:rPr>
-        <w:t xml:space="preserve">Edge Cases</w:t>
+        <w:t xml:space="preserve">Headings Hierarchy</w:t>
       </w:r>
     </w:p>
     <w:p>
@@ -3629,6 +3637,183 @@
           <w:szCs w:val="24"/>
         </w:rPr>
         <w:t xml:space="preserve">10.1 </w:t>
+      </w:r>
+      <w:r>
+        <w:rPr>
+          <w:rFonts w:ascii="Roboto" w:cs="Roboto" w:eastAsia="Roboto" w:hAnsi="Roboto"/>
+          <w:b/>
+          <w:bCs/>
+          <w:i w:val="false"/>
+          <w:iCs w:val="false"/>
+          <w:color w:val="058775"/>
+          <w:sz w:val="24"/>
+          <w:szCs w:val="24"/>
+        </w:rPr>
+        <w:t xml:space="preserve">Third-Level Heading (H3)</w:t>
+      </w:r>
+    </w:p>
+    <w:p>
+      <w:pPr>
+        <w:spacing w:after="120" w:line="360"/>
+      </w:pPr>
+      <w:r>
+        <w:rPr>
+          <w:rFonts w:ascii="Roboto" w:cs="Roboto" w:eastAsia="Roboto" w:hAnsi="Roboto"/>
+          <w:b w:val="false"/>
+          <w:bCs w:val="false"/>
+          <w:i w:val="false"/>
+          <w:iCs w:val="false"/>
+          <w:color w:val="353744"/>
+          <w:sz w:val="20"/>
+          <w:szCs w:val="20"/>
+        </w:rPr>
+        <w:t xml:space="preserve">Content under H3 to verify green color and section numbering.</w:t>
+      </w:r>
+    </w:p>
+    <w:p>
+      <w:pPr>
+        <w:pStyle w:val="Heading4"/>
+        <w:spacing w:after="120" w:before="200"/>
+      </w:pPr>
+      <w:r>
+        <w:rPr>
+          <w:rFonts w:ascii="Roboto" w:cs="Roboto" w:eastAsia="Roboto" w:hAnsi="Roboto"/>
+          <w:b/>
+          <w:bCs/>
+          <w:color w:val="272727"/>
+          <w:sz w:val="22"/>
+          <w:szCs w:val="22"/>
+        </w:rPr>
+        <w:t xml:space="preserve">10.1.1 </w:t>
+      </w:r>
+      <w:r>
+        <w:rPr>
+          <w:rFonts w:ascii="Roboto" w:cs="Roboto" w:eastAsia="Roboto" w:hAnsi="Roboto"/>
+          <w:b/>
+          <w:bCs/>
+          <w:i w:val="false"/>
+          <w:iCs w:val="false"/>
+          <w:color w:val="272727"/>
+          <w:sz w:val="22"/>
+          <w:szCs w:val="22"/>
+        </w:rPr>
+        <w:t xml:space="preserve">Fourth-Level Heading (H4)</w:t>
+      </w:r>
+    </w:p>
+    <w:p>
+      <w:pPr>
+        <w:spacing w:after="120" w:line="360"/>
+      </w:pPr>
+      <w:r>
+        <w:rPr>
+          <w:rFonts w:ascii="Roboto" w:cs="Roboto" w:eastAsia="Roboto" w:hAnsi="Roboto"/>
+          <w:b w:val="false"/>
+          <w:bCs w:val="false"/>
+          <w:i w:val="false"/>
+          <w:iCs w:val="false"/>
+          <w:color w:val="353744"/>
+          <w:sz w:val="20"/>
+          <w:szCs w:val="20"/>
+        </w:rPr>
+        <w:t xml:space="preserve">Content under H4 to verify dark2 color and deeper numbering (e.g. 7.1.1).</w:t>
+      </w:r>
+    </w:p>
+    <w:p>
+      <w:pPr>
+        <w:pStyle w:val="Heading3"/>
+        <w:spacing w:after="120" w:before="200"/>
+      </w:pPr>
+      <w:r>
+        <w:rPr>
+          <w:rFonts w:ascii="Roboto" w:cs="Roboto" w:eastAsia="Roboto" w:hAnsi="Roboto"/>
+          <w:b/>
+          <w:bCs/>
+          <w:color w:val="058775"/>
+          <w:sz w:val="24"/>
+          <w:szCs w:val="24"/>
+        </w:rPr>
+        <w:t xml:space="preserve">10.2 </w:t>
+      </w:r>
+      <w:r>
+        <w:rPr>
+          <w:rFonts w:ascii="Roboto" w:cs="Roboto" w:eastAsia="Roboto" w:hAnsi="Roboto"/>
+          <w:b/>
+          <w:bCs/>
+          <w:i w:val="false"/>
+          <w:iCs w:val="false"/>
+          <w:color w:val="058775"/>
+          <w:sz w:val="24"/>
+          <w:szCs w:val="24"/>
+        </w:rPr>
+        <w:t xml:space="preserve">Another H3</w:t>
+      </w:r>
+    </w:p>
+    <w:p>
+      <w:pPr>
+        <w:spacing w:after="120" w:line="360"/>
+      </w:pPr>
+      <w:r>
+        <w:rPr>
+          <w:rFonts w:ascii="Roboto" w:cs="Roboto" w:eastAsia="Roboto" w:hAnsi="Roboto"/>
+          <w:b w:val="false"/>
+          <w:bCs w:val="false"/>
+          <w:i w:val="false"/>
+          <w:iCs w:val="false"/>
+          <w:color w:val="353744"/>
+          <w:sz w:val="20"/>
+          <w:szCs w:val="20"/>
+        </w:rPr>
+        <w:t xml:space="preserve">Back to H3 to verify counter resets properly.</w:t>
+      </w:r>
+    </w:p>
+    <w:p>
+      <w:pPr>
+        <w:pStyle w:val="Heading2"/>
+        <w:pBdr>
+          <w:bottom w:val="single" w:color="353744" w:sz="4"/>
+        </w:pBdr>
+        <w:spacing w:after="120" w:before="320"/>
+      </w:pPr>
+      <w:r>
+        <w:rPr>
+          <w:rFonts w:ascii="Roboto" w:cs="Roboto" w:eastAsia="Roboto" w:hAnsi="Roboto"/>
+          <w:b/>
+          <w:bCs/>
+          <w:color w:val="353744"/>
+          <w:sz w:val="26"/>
+          <w:szCs w:val="26"/>
+        </w:rPr>
+        <w:t xml:space="preserve">11 </w:t>
+      </w:r>
+      <w:r>
+        <w:rPr>
+          <w:rFonts w:ascii="Roboto" w:cs="Roboto" w:eastAsia="Roboto" w:hAnsi="Roboto"/>
+          <w:b/>
+          <w:bCs/>
+          <w:i w:val="false"/>
+          <w:iCs w:val="false"/>
+          <w:color w:val="353744"/>
+          <w:sz w:val="26"/>
+          <w:szCs w:val="26"/>
+        </w:rPr>
+        <w:t xml:space="preserve">Edge Cases</w:t>
+      </w:r>
+    </w:p>
+    <w:p>
+      <w:pPr>
+        <w:pStyle w:val="Heading3"/>
+        <w:spacing w:after="120" w:before="200"/>
+      </w:pPr>
+      <w:r>
+        <w:rPr>
+          <w:rFonts w:ascii="Roboto" w:cs="Roboto" w:eastAsia="Roboto" w:hAnsi="Roboto"/>
+          <w:b/>
+          <w:bCs/>
+          <w:color w:val="058775"/>
+          <w:sz w:val="24"/>
+          <w:szCs w:val="24"/>
+        </w:rPr>
+        <w:t xml:space="preserve">11.1 </w:t>
       </w:r>
       <w:r>
         <w:rPr>
@@ -3899,7 +4084,7 @@
           <w:sz w:val="24"/>
           <w:szCs w:val="24"/>
         </w:rPr>
-        <w:t xml:space="preserve">10.2 </w:t>
+        <w:t xml:space="preserve">11.2 </w:t>
       </w:r>
       <w:r>
         <w:rPr>
@@ -3974,7 +4159,7 @@
           <w:sz w:val="24"/>
           <w:szCs w:val="24"/>
         </w:rPr>
-        <w:t xml:space="preserve">10.3 </w:t>
+        <w:t xml:space="preserve">11.3 </w:t>
       </w:r>
       <w:r>
         <w:rPr>
@@ -4132,7 +4317,7 @@
           <w:sz w:val="24"/>
           <w:szCs w:val="24"/>
         </w:rPr>
-        <w:t xml:space="preserve">10.4 </w:t>
+        <w:t xml:space="preserve">11.4 </w:t>
       </w:r>
       <w:r>
         <w:rPr>
@@ -4183,7 +4368,7 @@
           <w:sz w:val="26"/>
           <w:szCs w:val="26"/>
         </w:rPr>
-        <w:t xml:space="preserve">11 </w:t>
+        <w:t xml:space="preserve">12 </w:t>
       </w:r>
       <w:r>
         <w:rPr>

</xml_diff>

<commit_message>
fix: restart ordered list numbering in DOCX output
Word ignores <w:startOverride> when multiple <w:num> entries share the
same <w:abstractNum>. Generate a separate abstract numbering definition
per ordered list so each gets its own <w:abstractNumId> and restarts
from 1.

Co-Authored-By: Claude Opus 4.6 (1M context) <noreply@anthropic.com>
</commit_message>
<xml_diff>
--- a/test/output/fixture.docx
+++ b/test/output/fixture.docx
@@ -57,7 +57,7 @@
         </w:rPr>
         <w:t xml:space="preserve">	</w:t>
       </w:r>
-      <w:hyperlink w:history="1" r:id="rIdlfu-cg8d7n8ula4cpuibt">
+      <w:hyperlink w:history="1" r:id="rIdn2g6c_lpifzio1ezqa4ay">
         <w:r>
           <w:rPr>
             <w:rFonts w:ascii="Roboto" w:cs="Roboto" w:eastAsia="Roboto" w:hAnsi="Roboto"/>
@@ -74,7 +74,7 @@
         <w:spacing w:after="400"/>
         <w:jc w:val="right"/>
       </w:pPr>
-      <w:hyperlink w:history="1" r:id="rIddtsjtosuotm6vneguaxsm">
+      <w:hyperlink w:history="1" r:id="rId1qycni47rcla0fzwh6ro7">
         <w:r>
           <w:rPr>
             <w:rFonts w:ascii="Roboto" w:cs="Roboto" w:eastAsia="Roboto" w:hAnsi="Roboto"/>
@@ -957,7 +957,7 @@
         </w:rPr>
         <w:t xml:space="preserve"> and a </w:t>
       </w:r>
-      <w:hyperlink w:history="1" r:id="rIdvabcwvxsk6sawijqo9o-2">
+      <w:hyperlink w:history="1" r:id="rIdmbevadsnihb9ztlp7eqyl">
         <w:r>
           <w:rPr>
             <w:rFonts w:ascii="Roboto" w:cs="Roboto" w:eastAsia="Roboto" w:hAnsi="Roboto"/>
@@ -2286,7 +2286,7 @@
               </w:rPr>
               <w:t xml:space="preserve">See </w:t>
             </w:r>
-            <w:hyperlink w:history="1" r:id="rIdovcahfjqnsnjazd75og2w">
+            <w:hyperlink w:history="1" r:id="rIdbgyaq7w5se_mghujdr2tj">
               <w:r>
                 <w:rPr>
                   <w:rFonts w:ascii="Roboto" w:cs="Roboto" w:eastAsia="Roboto" w:hAnsi="Roboto"/>
@@ -2833,7 +2833,7 @@
         <w:pStyle w:val="ListParagraph"/>
         <w:numPr>
           <w:ilvl w:val="1"/>
-          <w:numId w:val="3"/>
+          <w:numId w:val="4"/>
         </w:numPr>
         <w:spacing w:after="40" w:line="360"/>
       </w:pPr>
@@ -2856,7 +2856,7 @@
         <w:pStyle w:val="ListParagraph"/>
         <w:numPr>
           <w:ilvl w:val="1"/>
-          <w:numId w:val="3"/>
+          <w:numId w:val="4"/>
         </w:numPr>
         <w:spacing w:after="40" w:line="360"/>
       </w:pPr>
@@ -2879,7 +2879,7 @@
         <w:pStyle w:val="ListParagraph"/>
         <w:numPr>
           <w:ilvl w:val="2"/>
-          <w:numId w:val="3"/>
+          <w:numId w:val="5"/>
         </w:numPr>
         <w:spacing w:after="40" w:line="360"/>
       </w:pPr>
@@ -2978,7 +2978,7 @@
         <w:pStyle w:val="ListParagraph"/>
         <w:numPr>
           <w:ilvl w:val="1"/>
-          <w:numId w:val="3"/>
+          <w:numId w:val="6"/>
         </w:numPr>
         <w:spacing w:after="40" w:line="360"/>
       </w:pPr>
@@ -3001,7 +3001,7 @@
         <w:pStyle w:val="ListParagraph"/>
         <w:numPr>
           <w:ilvl w:val="1"/>
-          <w:numId w:val="3"/>
+          <w:numId w:val="6"/>
         </w:numPr>
         <w:spacing w:after="40" w:line="360"/>
       </w:pPr>
@@ -3070,7 +3070,7 @@
         <w:pStyle w:val="ListParagraph"/>
         <w:numPr>
           <w:ilvl w:val="2"/>
-          <w:numId w:val="3"/>
+          <w:numId w:val="7"/>
         </w:numPr>
         <w:spacing w:after="40" w:line="360"/>
       </w:pPr>
@@ -5257,6 +5257,342 @@
       </w:pPr>
     </w:lvl>
   </w:abstractNum>
+  <w:abstractNum w:abstractNumId="4" w15:restartNumberingAfterBreak="0">
+    <w:multiLevelType w:val="hybridMultilevel"/>
+    <w:lvl w:ilvl="0" w15:tentative="1">
+      <w:start w:val="1"/>
+      <w:numFmt w:val="decimal"/>
+      <w:lvlText w:val="%1."/>
+      <w:lvlJc w:val="left"/>
+      <w:pPr>
+        <w:ind w:left="283" w:hanging="170"/>
+      </w:pPr>
+    </w:lvl>
+    <w:lvl w:ilvl="1" w15:tentative="1">
+      <w:start w:val="1"/>
+      <w:numFmt w:val="lowerLetter"/>
+      <w:lvlText w:val="%2."/>
+      <w:lvlJc w:val="left"/>
+      <w:pPr>
+        <w:ind w:left="566" w:hanging="170"/>
+      </w:pPr>
+    </w:lvl>
+    <w:lvl w:ilvl="2" w15:tentative="1">
+      <w:start w:val="1"/>
+      <w:numFmt w:val="lowerRoman"/>
+      <w:lvlText w:val="%3."/>
+      <w:lvlJc w:val="left"/>
+      <w:pPr>
+        <w:ind w:left="850" w:hanging="170"/>
+      </w:pPr>
+    </w:lvl>
+    <w:lvl w:ilvl="3" w15:tentative="1">
+      <w:start w:val="1"/>
+      <w:numFmt w:val="decimal"/>
+      <w:lvlText w:val="%4."/>
+      <w:lvlJc w:val="left"/>
+      <w:pPr>
+        <w:ind w:left="1133" w:hanging="170"/>
+      </w:pPr>
+    </w:lvl>
+    <w:lvl w:ilvl="4" w15:tentative="1">
+      <w:start w:val="1"/>
+      <w:numFmt w:val="lowerLetter"/>
+      <w:lvlText w:val="%5."/>
+      <w:lvlJc w:val="left"/>
+      <w:pPr>
+        <w:ind w:left="1417" w:hanging="170"/>
+      </w:pPr>
+    </w:lvl>
+    <w:lvl w:ilvl="5" w15:tentative="1">
+      <w:start w:val="1"/>
+      <w:numFmt w:val="lowerRoman"/>
+      <w:lvlText w:val="%6."/>
+      <w:lvlJc w:val="left"/>
+      <w:pPr>
+        <w:ind w:left="1700" w:hanging="170"/>
+      </w:pPr>
+    </w:lvl>
+    <w:lvl w:ilvl="6" w15:tentative="1">
+      <w:start w:val="1"/>
+      <w:numFmt w:val="decimal"/>
+      <w:lvlText w:val="%7."/>
+      <w:lvlJc w:val="left"/>
+      <w:pPr>
+        <w:ind w:left="1984" w:hanging="170"/>
+      </w:pPr>
+    </w:lvl>
+    <w:lvl w:ilvl="7" w15:tentative="1">
+      <w:start w:val="1"/>
+      <w:numFmt w:val="lowerLetter"/>
+      <w:lvlText w:val="%8."/>
+      <w:lvlJc w:val="left"/>
+      <w:pPr>
+        <w:ind w:left="2267" w:hanging="170"/>
+      </w:pPr>
+    </w:lvl>
+    <w:lvl w:ilvl="8" w15:tentative="1">
+      <w:start w:val="1"/>
+      <w:numFmt w:val="lowerRoman"/>
+      <w:lvlText w:val="%9."/>
+      <w:lvlJc w:val="left"/>
+      <w:pPr>
+        <w:ind w:left="2551" w:hanging="170"/>
+      </w:pPr>
+    </w:lvl>
+  </w:abstractNum>
+  <w:abstractNum w:abstractNumId="5" w15:restartNumberingAfterBreak="0">
+    <w:multiLevelType w:val="hybridMultilevel"/>
+    <w:lvl w:ilvl="0" w15:tentative="1">
+      <w:start w:val="1"/>
+      <w:numFmt w:val="decimal"/>
+      <w:lvlText w:val="%1."/>
+      <w:lvlJc w:val="left"/>
+      <w:pPr>
+        <w:ind w:left="283" w:hanging="170"/>
+      </w:pPr>
+    </w:lvl>
+    <w:lvl w:ilvl="1" w15:tentative="1">
+      <w:start w:val="1"/>
+      <w:numFmt w:val="lowerLetter"/>
+      <w:lvlText w:val="%2."/>
+      <w:lvlJc w:val="left"/>
+      <w:pPr>
+        <w:ind w:left="566" w:hanging="170"/>
+      </w:pPr>
+    </w:lvl>
+    <w:lvl w:ilvl="2" w15:tentative="1">
+      <w:start w:val="1"/>
+      <w:numFmt w:val="lowerRoman"/>
+      <w:lvlText w:val="%3."/>
+      <w:lvlJc w:val="left"/>
+      <w:pPr>
+        <w:ind w:left="850" w:hanging="170"/>
+      </w:pPr>
+    </w:lvl>
+    <w:lvl w:ilvl="3" w15:tentative="1">
+      <w:start w:val="1"/>
+      <w:numFmt w:val="decimal"/>
+      <w:lvlText w:val="%4."/>
+      <w:lvlJc w:val="left"/>
+      <w:pPr>
+        <w:ind w:left="1133" w:hanging="170"/>
+      </w:pPr>
+    </w:lvl>
+    <w:lvl w:ilvl="4" w15:tentative="1">
+      <w:start w:val="1"/>
+      <w:numFmt w:val="lowerLetter"/>
+      <w:lvlText w:val="%5."/>
+      <w:lvlJc w:val="left"/>
+      <w:pPr>
+        <w:ind w:left="1417" w:hanging="170"/>
+      </w:pPr>
+    </w:lvl>
+    <w:lvl w:ilvl="5" w15:tentative="1">
+      <w:start w:val="1"/>
+      <w:numFmt w:val="lowerRoman"/>
+      <w:lvlText w:val="%6."/>
+      <w:lvlJc w:val="left"/>
+      <w:pPr>
+        <w:ind w:left="1700" w:hanging="170"/>
+      </w:pPr>
+    </w:lvl>
+    <w:lvl w:ilvl="6" w15:tentative="1">
+      <w:start w:val="1"/>
+      <w:numFmt w:val="decimal"/>
+      <w:lvlText w:val="%7."/>
+      <w:lvlJc w:val="left"/>
+      <w:pPr>
+        <w:ind w:left="1984" w:hanging="170"/>
+      </w:pPr>
+    </w:lvl>
+    <w:lvl w:ilvl="7" w15:tentative="1">
+      <w:start w:val="1"/>
+      <w:numFmt w:val="lowerLetter"/>
+      <w:lvlText w:val="%8."/>
+      <w:lvlJc w:val="left"/>
+      <w:pPr>
+        <w:ind w:left="2267" w:hanging="170"/>
+      </w:pPr>
+    </w:lvl>
+    <w:lvl w:ilvl="8" w15:tentative="1">
+      <w:start w:val="1"/>
+      <w:numFmt w:val="lowerRoman"/>
+      <w:lvlText w:val="%9."/>
+      <w:lvlJc w:val="left"/>
+      <w:pPr>
+        <w:ind w:left="2551" w:hanging="170"/>
+      </w:pPr>
+    </w:lvl>
+  </w:abstractNum>
+  <w:abstractNum w:abstractNumId="6" w15:restartNumberingAfterBreak="0">
+    <w:multiLevelType w:val="hybridMultilevel"/>
+    <w:lvl w:ilvl="0" w15:tentative="1">
+      <w:start w:val="1"/>
+      <w:numFmt w:val="decimal"/>
+      <w:lvlText w:val="%1."/>
+      <w:lvlJc w:val="left"/>
+      <w:pPr>
+        <w:ind w:left="283" w:hanging="170"/>
+      </w:pPr>
+    </w:lvl>
+    <w:lvl w:ilvl="1" w15:tentative="1">
+      <w:start w:val="1"/>
+      <w:numFmt w:val="lowerLetter"/>
+      <w:lvlText w:val="%2."/>
+      <w:lvlJc w:val="left"/>
+      <w:pPr>
+        <w:ind w:left="566" w:hanging="170"/>
+      </w:pPr>
+    </w:lvl>
+    <w:lvl w:ilvl="2" w15:tentative="1">
+      <w:start w:val="1"/>
+      <w:numFmt w:val="lowerRoman"/>
+      <w:lvlText w:val="%3."/>
+      <w:lvlJc w:val="left"/>
+      <w:pPr>
+        <w:ind w:left="850" w:hanging="170"/>
+      </w:pPr>
+    </w:lvl>
+    <w:lvl w:ilvl="3" w15:tentative="1">
+      <w:start w:val="1"/>
+      <w:numFmt w:val="decimal"/>
+      <w:lvlText w:val="%4."/>
+      <w:lvlJc w:val="left"/>
+      <w:pPr>
+        <w:ind w:left="1133" w:hanging="170"/>
+      </w:pPr>
+    </w:lvl>
+    <w:lvl w:ilvl="4" w15:tentative="1">
+      <w:start w:val="1"/>
+      <w:numFmt w:val="lowerLetter"/>
+      <w:lvlText w:val="%5."/>
+      <w:lvlJc w:val="left"/>
+      <w:pPr>
+        <w:ind w:left="1417" w:hanging="170"/>
+      </w:pPr>
+    </w:lvl>
+    <w:lvl w:ilvl="5" w15:tentative="1">
+      <w:start w:val="1"/>
+      <w:numFmt w:val="lowerRoman"/>
+      <w:lvlText w:val="%6."/>
+      <w:lvlJc w:val="left"/>
+      <w:pPr>
+        <w:ind w:left="1700" w:hanging="170"/>
+      </w:pPr>
+    </w:lvl>
+    <w:lvl w:ilvl="6" w15:tentative="1">
+      <w:start w:val="1"/>
+      <w:numFmt w:val="decimal"/>
+      <w:lvlText w:val="%7."/>
+      <w:lvlJc w:val="left"/>
+      <w:pPr>
+        <w:ind w:left="1984" w:hanging="170"/>
+      </w:pPr>
+    </w:lvl>
+    <w:lvl w:ilvl="7" w15:tentative="1">
+      <w:start w:val="1"/>
+      <w:numFmt w:val="lowerLetter"/>
+      <w:lvlText w:val="%8."/>
+      <w:lvlJc w:val="left"/>
+      <w:pPr>
+        <w:ind w:left="2267" w:hanging="170"/>
+      </w:pPr>
+    </w:lvl>
+    <w:lvl w:ilvl="8" w15:tentative="1">
+      <w:start w:val="1"/>
+      <w:numFmt w:val="lowerRoman"/>
+      <w:lvlText w:val="%9."/>
+      <w:lvlJc w:val="left"/>
+      <w:pPr>
+        <w:ind w:left="2551" w:hanging="170"/>
+      </w:pPr>
+    </w:lvl>
+  </w:abstractNum>
+  <w:abstractNum w:abstractNumId="7" w15:restartNumberingAfterBreak="0">
+    <w:multiLevelType w:val="hybridMultilevel"/>
+    <w:lvl w:ilvl="0" w15:tentative="1">
+      <w:start w:val="1"/>
+      <w:numFmt w:val="decimal"/>
+      <w:lvlText w:val="%1."/>
+      <w:lvlJc w:val="left"/>
+      <w:pPr>
+        <w:ind w:left="283" w:hanging="170"/>
+      </w:pPr>
+    </w:lvl>
+    <w:lvl w:ilvl="1" w15:tentative="1">
+      <w:start w:val="1"/>
+      <w:numFmt w:val="lowerLetter"/>
+      <w:lvlText w:val="%2."/>
+      <w:lvlJc w:val="left"/>
+      <w:pPr>
+        <w:ind w:left="566" w:hanging="170"/>
+      </w:pPr>
+    </w:lvl>
+    <w:lvl w:ilvl="2" w15:tentative="1">
+      <w:start w:val="1"/>
+      <w:numFmt w:val="lowerRoman"/>
+      <w:lvlText w:val="%3."/>
+      <w:lvlJc w:val="left"/>
+      <w:pPr>
+        <w:ind w:left="850" w:hanging="170"/>
+      </w:pPr>
+    </w:lvl>
+    <w:lvl w:ilvl="3" w15:tentative="1">
+      <w:start w:val="1"/>
+      <w:numFmt w:val="decimal"/>
+      <w:lvlText w:val="%4."/>
+      <w:lvlJc w:val="left"/>
+      <w:pPr>
+        <w:ind w:left="1133" w:hanging="170"/>
+      </w:pPr>
+    </w:lvl>
+    <w:lvl w:ilvl="4" w15:tentative="1">
+      <w:start w:val="1"/>
+      <w:numFmt w:val="lowerLetter"/>
+      <w:lvlText w:val="%5."/>
+      <w:lvlJc w:val="left"/>
+      <w:pPr>
+        <w:ind w:left="1417" w:hanging="170"/>
+      </w:pPr>
+    </w:lvl>
+    <w:lvl w:ilvl="5" w15:tentative="1">
+      <w:start w:val="1"/>
+      <w:numFmt w:val="lowerRoman"/>
+      <w:lvlText w:val="%6."/>
+      <w:lvlJc w:val="left"/>
+      <w:pPr>
+        <w:ind w:left="1700" w:hanging="170"/>
+      </w:pPr>
+    </w:lvl>
+    <w:lvl w:ilvl="6" w15:tentative="1">
+      <w:start w:val="1"/>
+      <w:numFmt w:val="decimal"/>
+      <w:lvlText w:val="%7."/>
+      <w:lvlJc w:val="left"/>
+      <w:pPr>
+        <w:ind w:left="1984" w:hanging="170"/>
+      </w:pPr>
+    </w:lvl>
+    <w:lvl w:ilvl="7" w15:tentative="1">
+      <w:start w:val="1"/>
+      <w:numFmt w:val="lowerLetter"/>
+      <w:lvlText w:val="%8."/>
+      <w:lvlJc w:val="left"/>
+      <w:pPr>
+        <w:ind w:left="2267" w:hanging="170"/>
+      </w:pPr>
+    </w:lvl>
+    <w:lvl w:ilvl="8" w15:tentative="1">
+      <w:start w:val="1"/>
+      <w:numFmt w:val="lowerRoman"/>
+      <w:lvlText w:val="%9."/>
+      <w:lvlJc w:val="left"/>
+      <w:pPr>
+        <w:ind w:left="2551" w:hanging="170"/>
+      </w:pPr>
+    </w:lvl>
+  </w:abstractNum>
   <w:num w:numId="1">
     <w:abstractNumId w:val="1"/>
     <w:lvlOverride w:ilvl="0">
@@ -5271,6 +5607,30 @@
   </w:num>
   <w:num w:numId="3">
     <w:abstractNumId w:val="3"/>
+    <w:lvlOverride w:ilvl="0">
+      <w:startOverride w:val="1"/>
+    </w:lvlOverride>
+  </w:num>
+  <w:num w:numId="4">
+    <w:abstractNumId w:val="4"/>
+    <w:lvlOverride w:ilvl="0">
+      <w:startOverride w:val="1"/>
+    </w:lvlOverride>
+  </w:num>
+  <w:num w:numId="5">
+    <w:abstractNumId w:val="5"/>
+    <w:lvlOverride w:ilvl="0">
+      <w:startOverride w:val="1"/>
+    </w:lvlOverride>
+  </w:num>
+  <w:num w:numId="6">
+    <w:abstractNumId w:val="6"/>
+    <w:lvlOverride w:ilvl="0">
+      <w:startOverride w:val="1"/>
+    </w:lvlOverride>
+  </w:num>
+  <w:num w:numId="7">
+    <w:abstractNumId w:val="7"/>
     <w:lvlOverride w:ilvl="0">
       <w:startOverride w:val="1"/>
     </w:lvlOverride>

</xml_diff>

<commit_message>
feat: per-diagram mermaid sizing via fence options
Authors can now write ```mermaid maxWidth=300 align=left to control the
rendered width and alignment of individual diagrams in both PDF and DOCX.
Supported keys: `maxWidth` (pixels, default 500) and `align`
(left/center/right, default center). Invalid values warn to stderr and
fall back to defaults.

Co-Authored-By: Claude Opus 4.7 (1M context) <noreply@anthropic.com>
</commit_message>
<xml_diff>
--- a/test/output/fixture.docx
+++ b/test/output/fixture.docx
@@ -57,7 +57,7 @@
         </w:rPr>
         <w:t xml:space="preserve">	</w:t>
       </w:r>
-      <w:hyperlink w:history="1" r:id="rIdn2g6c_lpifzio1ezqa4ay">
+      <w:hyperlink w:history="1" r:id="rIdiq1sc-j-xb0uzyjdyyknr">
         <w:r>
           <w:rPr>
             <w:rFonts w:ascii="Roboto" w:cs="Roboto" w:eastAsia="Roboto" w:hAnsi="Roboto"/>
@@ -74,7 +74,7 @@
         <w:spacing w:after="400"/>
         <w:jc w:val="right"/>
       </w:pPr>
-      <w:hyperlink w:history="1" r:id="rId1qycni47rcla0fzwh6ro7">
+      <w:hyperlink w:history="1" r:id="rIdjnkhes5mhanso3f_5bzv1">
         <w:r>
           <w:rPr>
             <w:rFonts w:ascii="Roboto" w:cs="Roboto" w:eastAsia="Roboto" w:hAnsi="Roboto"/>
@@ -957,7 +957,7 @@
         </w:rPr>
         <w:t xml:space="preserve"> and a </w:t>
       </w:r>
-      <w:hyperlink w:history="1" r:id="rIdmbevadsnihb9ztlp7eqyl">
+      <w:hyperlink w:history="1" r:id="rIdvd93f0-qf5e5jaavlab7w">
         <w:r>
           <w:rPr>
             <w:rFonts w:ascii="Roboto" w:cs="Roboto" w:eastAsia="Roboto" w:hAnsi="Roboto"/>
@@ -2286,7 +2286,7 @@
               </w:rPr>
               <w:t xml:space="preserve">See </w:t>
             </w:r>
-            <w:hyperlink w:history="1" r:id="rIdbgyaq7w5se_mghujdr2tj">
+            <w:hyperlink w:history="1" r:id="rIdwpzxiwqeqdy6naxi8_0er">
               <w:r>
                 <w:rPr>
                   <w:rFonts w:ascii="Roboto" w:cs="Roboto" w:eastAsia="Roboto" w:hAnsi="Roboto"/>
@@ -3500,6 +3500,82 @@
                     <a:xfrm>
                       <a:off x="0" y="0"/>
                       <a:ext cx="4762500" cy="2419350"/>
+                    </a:xfrm>
+                    <a:prstGeom prst="rect">
+                      <a:avLst/>
+                    </a:prstGeom>
+                  </pic:spPr>
+                </pic:pic>
+              </a:graphicData>
+            </a:graphic>
+          </wp:inline>
+        </w:drawing>
+      </w:r>
+    </w:p>
+    <w:p>
+      <w:pPr>
+        <w:pStyle w:val="Heading3"/>
+        <w:spacing w:after="120" w:before="200"/>
+      </w:pPr>
+      <w:r>
+        <w:rPr>
+          <w:rFonts w:ascii="Roboto" w:cs="Roboto" w:eastAsia="Roboto" w:hAnsi="Roboto"/>
+          <w:b/>
+          <w:bCs/>
+          <w:color w:val="058775"/>
+          <w:sz w:val="24"/>
+          <w:szCs w:val="24"/>
+        </w:rPr>
+        <w:t xml:space="preserve">8.3 </w:t>
+      </w:r>
+      <w:r>
+        <w:rPr>
+          <w:rFonts w:ascii="Roboto" w:cs="Roboto" w:eastAsia="Roboto" w:hAnsi="Roboto"/>
+          <w:b/>
+          <w:bCs/>
+          <w:i w:val="false"/>
+          <w:iCs w:val="false"/>
+          <w:color w:val="058775"/>
+          <w:sz w:val="24"/>
+          <w:szCs w:val="24"/>
+        </w:rPr>
+        <w:t xml:space="preserve">Sized Diagram</w:t>
+      </w:r>
+    </w:p>
+    <w:p>
+      <w:pPr>
+        <w:spacing w:after="120" w:before="120"/>
+        <w:jc w:val="left"/>
+      </w:pPr>
+      <w:r>
+        <w:drawing>
+          <wp:inline distT="0" distB="0" distL="0" distR="0">
+            <wp:extent cx="1905000" cy="657225"/>
+            <wp:effectExtent t="0" r="0" b="0" l="0"/>
+            <wp:docPr id="1" name="" descr="" title=""/>
+            <wp:cNvGraphicFramePr>
+              <a:graphicFrameLocks xmlns:a="http://schemas.openxmlformats.org/drawingml/2006/main" noChangeAspect="1"/>
+            </wp:cNvGraphicFramePr>
+            <a:graphic xmlns:a="http://schemas.openxmlformats.org/drawingml/2006/main">
+              <a:graphicData uri="http://schemas.openxmlformats.org/drawingml/2006/picture">
+                <pic:pic xmlns:pic="http://schemas.openxmlformats.org/drawingml/2006/picture">
+                  <pic:nvPicPr>
+                    <pic:cNvPr id="0" name="" descr=""/>
+                    <pic:cNvPicPr>
+                      <a:picLocks noChangeAspect="1" noChangeArrowheads="1"/>
+                    </pic:cNvPicPr>
+                  </pic:nvPicPr>
+                  <pic:blipFill>
+                    <a:blip r:embed="rId14" cstate="none"/>
+                    <a:srcRect/>
+                    <a:stretch>
+                      <a:fillRect/>
+                    </a:stretch>
+                  </pic:blipFill>
+                  <pic:spPr bwMode="auto">
+                    <a:xfrm>
+                      <a:off x="0" y="0"/>
+                      <a:ext cx="1905000" cy="657225"/>
                     </a:xfrm>
                     <a:prstGeom prst="rect">
                       <a:avLst/>

</xml_diff>

<commit_message>
feat: support `version` frontmatter field on cover page
Adds `version` to the supported frontmatter keys. When present, it
appears as a row in the cover metadata table (between Status and
Author) in both PDF and DOCX output. Omitted if absent.

Co-Authored-By: Claude Opus 4.7 (1M context) <noreply@anthropic.com>
</commit_message>
<xml_diff>
--- a/test/output/fixture.docx
+++ b/test/output/fixture.docx
@@ -57,7 +57,7 @@
         </w:rPr>
         <w:t xml:space="preserve">	</w:t>
       </w:r>
-      <w:hyperlink w:history="1" r:id="rIdiq1sc-j-xb0uzyjdyyknr">
+      <w:hyperlink w:history="1" r:id="rIdkjkpmgzxj5mhlba1bingl">
         <w:r>
           <w:rPr>
             <w:rFonts w:ascii="Roboto" w:cs="Roboto" w:eastAsia="Roboto" w:hAnsi="Roboto"/>
@@ -74,7 +74,7 @@
         <w:spacing w:after="400"/>
         <w:jc w:val="right"/>
       </w:pPr>
-      <w:hyperlink w:history="1" r:id="rIdjnkhes5mhanso3f_5bzv1">
+      <w:hyperlink w:history="1" r:id="rIddaayv9e3dobh2dtpqspq0">
         <w:r>
           <w:rPr>
             <w:rFonts w:ascii="Roboto" w:cs="Roboto" w:eastAsia="Roboto" w:hAnsi="Roboto"/>
@@ -512,7 +512,7 @@
                 <w:sz w:val="20"/>
                 <w:szCs w:val="20"/>
               </w:rPr>
-              <w:t xml:space="preserve">Author</w:t>
+              <w:t xml:space="preserve">Version</w:t>
             </w:r>
           </w:p>
         </w:tc>
@@ -544,7 +544,7 @@
                 <w:sz w:val="20"/>
                 <w:szCs w:val="20"/>
               </w:rPr>
-              <w:t xml:space="preserve">Cognizone</w:t>
+              <w:t xml:space="preserve">1.2</w:t>
             </w:r>
           </w:p>
         </w:tc>
@@ -581,7 +581,7 @@
                 <w:sz w:val="20"/>
                 <w:szCs w:val="20"/>
               </w:rPr>
-              <w:t xml:space="preserve">Client</w:t>
+              <w:t xml:space="preserve">Author</w:t>
             </w:r>
           </w:p>
         </w:tc>
@@ -613,7 +613,7 @@
                 <w:sz w:val="20"/>
                 <w:szCs w:val="20"/>
               </w:rPr>
-              <w:t xml:space="preserve">ERA — European Union Agency for Railways</w:t>
+              <w:t xml:space="preserve">Cognizone</w:t>
             </w:r>
           </w:p>
         </w:tc>
@@ -650,6 +650,75 @@
                 <w:sz w:val="20"/>
                 <w:szCs w:val="20"/>
               </w:rPr>
+              <w:t xml:space="preserve">Client</w:t>
+            </w:r>
+          </w:p>
+        </w:tc>
+        <w:tc>
+          <w:tcPr>
+            <w:tcW w:type="pct" w:w="70%"/>
+            <w:tcBorders>
+              <w:top w:val="single" w:color="BFBFBF" w:sz="4"/>
+              <w:left w:val="single" w:color="BFBFBF" w:sz="4"/>
+              <w:bottom w:val="single" w:color="BFBFBF" w:sz="4"/>
+              <w:right w:val="single" w:color="BFBFBF" w:sz="4"/>
+            </w:tcBorders>
+            <w:tcMar>
+              <w:top w:type="dxa" w:w="80"/>
+              <w:left w:type="dxa" w:w="120"/>
+              <w:bottom w:type="dxa" w:w="80"/>
+              <w:right w:type="dxa" w:w="120"/>
+            </w:tcMar>
+            <w:vAlign w:val="center"/>
+          </w:tcPr>
+          <w:p>
+            <w:pPr>
+              <w:spacing w:after="0" w:before="0" w:line="240"/>
+            </w:pPr>
+            <w:r>
+              <w:rPr>
+                <w:rFonts w:ascii="Roboto" w:cs="Roboto" w:eastAsia="Roboto" w:hAnsi="Roboto"/>
+                <w:color w:val="353744"/>
+                <w:sz w:val="20"/>
+                <w:szCs w:val="20"/>
+              </w:rPr>
+              <w:t xml:space="preserve">ERA — European Union Agency for Railways</w:t>
+            </w:r>
+          </w:p>
+        </w:tc>
+      </w:tr>
+      <w:tr>
+        <w:tc>
+          <w:tcPr>
+            <w:tcW w:type="pct" w:w="30%"/>
+            <w:tcBorders>
+              <w:top w:val="single" w:color="BFBFBF" w:sz="4"/>
+              <w:left w:val="single" w:color="BFBFBF" w:sz="4"/>
+              <w:bottom w:val="single" w:color="BFBFBF" w:sz="4"/>
+              <w:right w:val="single" w:color="BFBFBF" w:sz="4"/>
+            </w:tcBorders>
+            <w:shd w:fill="EAF0F8" w:val="clear"/>
+            <w:tcMar>
+              <w:top w:type="dxa" w:w="80"/>
+              <w:left w:type="dxa" w:w="120"/>
+              <w:bottom w:type="dxa" w:w="80"/>
+              <w:right w:type="dxa" w:w="120"/>
+            </w:tcMar>
+            <w:vAlign w:val="center"/>
+          </w:tcPr>
+          <w:p>
+            <w:pPr>
+              <w:spacing w:after="0" w:before="0" w:line="240"/>
+            </w:pPr>
+            <w:r>
+              <w:rPr>
+                <w:rFonts w:ascii="Roboto" w:cs="Roboto" w:eastAsia="Roboto" w:hAnsi="Roboto"/>
+                <w:b/>
+                <w:bCs/>
+                <w:color w:val="353744"/>
+                <w:sz w:val="20"/>
+                <w:szCs w:val="20"/>
+              </w:rPr>
               <w:t xml:space="preserve">Project</w:t>
             </w:r>
           </w:p>
@@ -957,7 +1026,7 @@
         </w:rPr>
         <w:t xml:space="preserve"> and a </w:t>
       </w:r>
-      <w:hyperlink w:history="1" r:id="rIdvd93f0-qf5e5jaavlab7w">
+      <w:hyperlink w:history="1" r:id="rIdqlf8kr2zta9ur-th4ntio">
         <w:r>
           <w:rPr>
             <w:rFonts w:ascii="Roboto" w:cs="Roboto" w:eastAsia="Roboto" w:hAnsi="Roboto"/>
@@ -2286,7 +2355,7 @@
               </w:rPr>
               <w:t xml:space="preserve">See </w:t>
             </w:r>
-            <w:hyperlink w:history="1" r:id="rIdwpzxiwqeqdy6naxi8_0er">
+            <w:hyperlink w:history="1" r:id="rIdcadlxp6utefdrcybflntk">
               <w:r>
                 <w:rPr>
                   <w:rFonts w:ascii="Roboto" w:cs="Roboto" w:eastAsia="Roboto" w:hAnsi="Roboto"/>

</xml_diff>

<commit_message>
fix: preserve exact version string from frontmatter
YAML parses `version: 1.0` as the number 1, which `String()` renders as
"1" — dropping the trailing zero. Read the version value from the raw
YAML text instead so the author's exact spelling survives. Quoted values
have their surrounding quotes stripped.

Co-Authored-By: Claude Opus 4.7 (1M context) <noreply@anthropic.com>
</commit_message>
<xml_diff>
--- a/test/output/fixture.docx
+++ b/test/output/fixture.docx
@@ -57,7 +57,7 @@
         </w:rPr>
         <w:t xml:space="preserve">	</w:t>
       </w:r>
-      <w:hyperlink w:history="1" r:id="rIdkjkpmgzxj5mhlba1bingl">
+      <w:hyperlink w:history="1" r:id="rIdkwiucalvlhotv2eezqb2h">
         <w:r>
           <w:rPr>
             <w:rFonts w:ascii="Roboto" w:cs="Roboto" w:eastAsia="Roboto" w:hAnsi="Roboto"/>
@@ -74,7 +74,7 @@
         <w:spacing w:after="400"/>
         <w:jc w:val="right"/>
       </w:pPr>
-      <w:hyperlink w:history="1" r:id="rIddaayv9e3dobh2dtpqspq0">
+      <w:hyperlink w:history="1" r:id="rIdyzvjnnwobnl6okqhv-ehl">
         <w:r>
           <w:rPr>
             <w:rFonts w:ascii="Roboto" w:cs="Roboto" w:eastAsia="Roboto" w:hAnsi="Roboto"/>
@@ -1026,7 +1026,7 @@
         </w:rPr>
         <w:t xml:space="preserve"> and a </w:t>
       </w:r>
-      <w:hyperlink w:history="1" r:id="rIdqlf8kr2zta9ur-th4ntio">
+      <w:hyperlink w:history="1" r:id="rId_24tlpteq2f8lspd7kd40">
         <w:r>
           <w:rPr>
             <w:rFonts w:ascii="Roboto" w:cs="Roboto" w:eastAsia="Roboto" w:hAnsi="Roboto"/>
@@ -2355,7 +2355,7 @@
               </w:rPr>
               <w:t xml:space="preserve">See </w:t>
             </w:r>
-            <w:hyperlink w:history="1" r:id="rIdcadlxp6utefdrcybflntk">
+            <w:hyperlink w:history="1" r:id="rIdi004-stxncqmovramg713">
               <w:r>
                 <w:rPr>
                   <w:rFonts w:ascii="Roboto" w:cs="Roboto" w:eastAsia="Roboto" w:hAnsi="Roboto"/>

</xml_diff>

<commit_message>
fix: keep headings on the same page as their following content
Chrome's PDF renderer and Word both sometimes strand a heading at the
bottom of a page with its body content pushed to the next. Added modern
`break-after: avoid` on headings plus `break-before: avoid` on the
immediately-following sibling in CSS, and `keepNext: true` /
`keepLines: true` on DOCX heading paragraphs.

Co-Authored-By: Claude Opus 4.7 (1M context) <noreply@anthropic.com>
</commit_message>
<xml_diff>
--- a/test/output/fixture.docx
+++ b/test/output/fixture.docx
@@ -57,7 +57,7 @@
         </w:rPr>
         <w:t xml:space="preserve">	</w:t>
       </w:r>
-      <w:hyperlink w:history="1" r:id="rIdkwiucalvlhotv2eezqb2h">
+      <w:hyperlink w:history="1" r:id="rIdkqybvhwcfksazx7y7lr0e">
         <w:r>
           <w:rPr>
             <w:rFonts w:ascii="Roboto" w:cs="Roboto" w:eastAsia="Roboto" w:hAnsi="Roboto"/>
@@ -74,7 +74,7 @@
         <w:spacing w:after="400"/>
         <w:jc w:val="right"/>
       </w:pPr>
-      <w:hyperlink w:history="1" r:id="rIdyzvjnnwobnl6okqhv-ehl">
+      <w:hyperlink w:history="1" r:id="rIdg9mlbe1c5ae96mcl4rzoa">
         <w:r>
           <w:rPr>
             <w:rFonts w:ascii="Roboto" w:cs="Roboto" w:eastAsia="Roboto" w:hAnsi="Roboto"/>
@@ -823,6 +823,8 @@
     <w:p>
       <w:pPr>
         <w:pStyle w:val="Heading2"/>
+        <w:keepNext/>
+        <w:keepLines/>
         <w:pBdr>
           <w:bottom w:val="single" w:color="353744" w:sz="4"/>
         </w:pBdr>
@@ -874,6 +876,8 @@
     <w:p>
       <w:pPr>
         <w:pStyle w:val="Heading2"/>
+        <w:keepNext/>
+        <w:keepLines/>
         <w:pBdr>
           <w:bottom w:val="single" w:color="353744" w:sz="4"/>
         </w:pBdr>
@@ -1026,7 +1030,7 @@
         </w:rPr>
         <w:t xml:space="preserve"> and a </w:t>
       </w:r>
-      <w:hyperlink w:history="1" r:id="rId_24tlpteq2f8lspd7kd40">
+      <w:hyperlink w:history="1" r:id="rIdoenzedb92mjozlg7tslsd">
         <w:r>
           <w:rPr>
             <w:rFonts w:ascii="Roboto" w:cs="Roboto" w:eastAsia="Roboto" w:hAnsi="Roboto"/>
@@ -1103,6 +1107,8 @@
     <w:p>
       <w:pPr>
         <w:pStyle w:val="Heading2"/>
+        <w:keepNext/>
+        <w:keepLines/>
         <w:pBdr>
           <w:bottom w:val="single" w:color="353744" w:sz="4"/>
         </w:pBdr>
@@ -1394,6 +1400,8 @@
     <w:p>
       <w:pPr>
         <w:pStyle w:val="Heading2"/>
+        <w:keepNext/>
+        <w:keepLines/>
         <w:pBdr>
           <w:bottom w:val="single" w:color="353744" w:sz="4"/>
         </w:pBdr>
@@ -1427,6 +1435,8 @@
     <w:p>
       <w:pPr>
         <w:pStyle w:val="Heading3"/>
+        <w:keepNext/>
+        <w:keepLines/>
         <w:spacing w:after="120" w:before="200"/>
       </w:pPr>
       <w:r>
@@ -2017,6 +2027,8 @@
     <w:p>
       <w:pPr>
         <w:pStyle w:val="Heading3"/>
+        <w:keepNext/>
+        <w:keepLines/>
         <w:spacing w:after="120" w:before="200"/>
       </w:pPr>
       <w:r>
@@ -2355,7 +2367,7 @@
               </w:rPr>
               <w:t xml:space="preserve">See </w:t>
             </w:r>
-            <w:hyperlink w:history="1" r:id="rIdi004-stxncqmovramg713">
+            <w:hyperlink w:history="1" r:id="rIdaif1ztdigy2ezar8qze72">
               <w:r>
                 <w:rPr>
                   <w:rFonts w:ascii="Roboto" w:cs="Roboto" w:eastAsia="Roboto" w:hAnsi="Roboto"/>
@@ -2537,6 +2549,8 @@
     <w:p>
       <w:pPr>
         <w:pStyle w:val="Heading2"/>
+        <w:keepNext/>
+        <w:keepLines/>
         <w:pBdr>
           <w:bottom w:val="single" w:color="353744" w:sz="4"/>
         </w:pBdr>
@@ -2570,6 +2584,8 @@
     <w:p>
       <w:pPr>
         <w:pStyle w:val="Heading3"/>
+        <w:keepNext/>
+        <w:keepLines/>
         <w:spacing w:after="120" w:before="200"/>
       </w:pPr>
       <w:r>
@@ -2788,6 +2804,8 @@
     <w:p>
       <w:pPr>
         <w:pStyle w:val="Heading3"/>
+        <w:keepNext/>
+        <w:keepLines/>
         <w:spacing w:after="120" w:before="200"/>
       </w:pPr>
       <w:r>
@@ -2992,6 +3010,8 @@
     <w:p>
       <w:pPr>
         <w:pStyle w:val="Heading3"/>
+        <w:keepNext/>
+        <w:keepLines/>
         <w:spacing w:after="120" w:before="200"/>
       </w:pPr>
       <w:r>
@@ -3160,6 +3180,8 @@
     <w:p>
       <w:pPr>
         <w:pStyle w:val="Heading2"/>
+        <w:keepNext/>
+        <w:keepLines/>
         <w:pBdr>
           <w:bottom w:val="single" w:color="353744" w:sz="4"/>
         </w:pBdr>
@@ -3240,6 +3262,8 @@
     <w:p>
       <w:pPr>
         <w:pStyle w:val="Heading2"/>
+        <w:keepNext/>
+        <w:keepLines/>
         <w:pBdr>
           <w:bottom w:val="single" w:color="353744" w:sz="4"/>
         </w:pBdr>
@@ -3399,6 +3423,8 @@
     <w:p>
       <w:pPr>
         <w:pStyle w:val="Heading2"/>
+        <w:keepNext/>
+        <w:keepLines/>
         <w:pBdr>
           <w:bottom w:val="single" w:color="353744" w:sz="4"/>
         </w:pBdr>
@@ -3432,6 +3458,8 @@
     <w:p>
       <w:pPr>
         <w:pStyle w:val="Heading3"/>
+        <w:keepNext/>
+        <w:keepLines/>
         <w:spacing w:after="120" w:before="200"/>
       </w:pPr>
       <w:r>
@@ -3508,6 +3536,8 @@
     <w:p>
       <w:pPr>
         <w:pStyle w:val="Heading3"/>
+        <w:keepNext/>
+        <w:keepLines/>
         <w:spacing w:after="120" w:before="200"/>
       </w:pPr>
       <w:r>
@@ -3584,6 +3614,8 @@
     <w:p>
       <w:pPr>
         <w:pStyle w:val="Heading3"/>
+        <w:keepNext/>
+        <w:keepLines/>
         <w:spacing w:after="120" w:before="200"/>
       </w:pPr>
       <w:r>
@@ -3660,6 +3692,8 @@
     <w:p>
       <w:pPr>
         <w:pStyle w:val="Heading2"/>
+        <w:keepNext/>
+        <w:keepLines/>
         <w:pBdr>
           <w:bottom w:val="single" w:color="353744" w:sz="4"/>
         </w:pBdr>
@@ -3737,6 +3771,8 @@
     <w:p>
       <w:pPr>
         <w:pStyle w:val="Heading2"/>
+        <w:keepNext/>
+        <w:keepLines/>
         <w:pBdr>
           <w:bottom w:val="single" w:color="353744" w:sz="4"/>
         </w:pBdr>
@@ -3770,6 +3806,8 @@
     <w:p>
       <w:pPr>
         <w:pStyle w:val="Heading3"/>
+        <w:keepNext/>
+        <w:keepLines/>
         <w:spacing w:after="120" w:before="200"/>
       </w:pPr>
       <w:r>
@@ -3818,6 +3856,8 @@
     <w:p>
       <w:pPr>
         <w:pStyle w:val="Heading4"/>
+        <w:keepNext/>
+        <w:keepLines/>
         <w:spacing w:after="120" w:before="200"/>
       </w:pPr>
       <w:r>
@@ -3866,6 +3906,8 @@
     <w:p>
       <w:pPr>
         <w:pStyle w:val="Heading3"/>
+        <w:keepNext/>
+        <w:keepLines/>
         <w:spacing w:after="120" w:before="200"/>
       </w:pPr>
       <w:r>
@@ -3914,6 +3956,8 @@
     <w:p>
       <w:pPr>
         <w:pStyle w:val="Heading2"/>
+        <w:keepNext/>
+        <w:keepLines/>
         <w:pBdr>
           <w:bottom w:val="single" w:color="353744" w:sz="4"/>
         </w:pBdr>
@@ -3947,6 +3991,8 @@
     <w:p>
       <w:pPr>
         <w:pStyle w:val="Heading3"/>
+        <w:keepNext/>
+        <w:keepLines/>
         <w:spacing w:after="120" w:before="200"/>
       </w:pPr>
       <w:r>
@@ -4218,6 +4264,8 @@
     <w:p>
       <w:pPr>
         <w:pStyle w:val="Heading3"/>
+        <w:keepNext/>
+        <w:keepLines/>
         <w:spacing w:after="120" w:before="200"/>
       </w:pPr>
       <w:r>
@@ -4293,6 +4341,8 @@
     <w:p>
       <w:pPr>
         <w:pStyle w:val="Heading3"/>
+        <w:keepNext/>
+        <w:keepLines/>
         <w:spacing w:after="120" w:before="200"/>
       </w:pPr>
       <w:r>
@@ -4451,6 +4501,8 @@
     <w:p>
       <w:pPr>
         <w:pStyle w:val="Heading3"/>
+        <w:keepNext/>
+        <w:keepLines/>
         <w:spacing w:after="120" w:before="200"/>
       </w:pPr>
       <w:r>
@@ -4499,6 +4551,8 @@
     <w:p>
       <w:pPr>
         <w:pStyle w:val="Heading2"/>
+        <w:keepNext/>
+        <w:keepLines/>
         <w:pBdr>
           <w:bottom w:val="single" w:color="353744" w:sz="4"/>
         </w:pBdr>

</xml_diff>

<commit_message>
fix: accurate TOC page numbers and remove blank pages
- Switch .page-break to break-before: empty marker divs with break-after were
  causing Chromium to render the marker on its own page, inserting one blank
  page per marker.
- Rework TOC page-number calculation: match viewport to printable content
  area (170 x 252 mm), wait for fonts to load, and walk elements in document
  order simulating page-break-inside: avoid (tables, code, mermaid) and
  heading stay-with-next so the JS estimate tracks Chromium's actual
  pagination instead of drifting more pages off the longer the doc gets.
- De-duplicate heading slugs in parse.js: sibling sections with identical
  titles (e.g. multiple "Required fields" subsections) now get distinct ids
  so each TOC link resolves to its own destination.

Co-Authored-By: Claude Opus 4.7 (1M context) <noreply@anthropic.com>
</commit_message>
<xml_diff>
--- a/test/output/fixture.docx
+++ b/test/output/fixture.docx
@@ -57,7 +57,7 @@
         </w:rPr>
         <w:t xml:space="preserve">	</w:t>
       </w:r>
-      <w:hyperlink w:history="1" r:id="rIdkqybvhwcfksazx7y7lr0e">
+      <w:hyperlink w:history="1" r:id="rId3u3gsjovoukir3omgy-vz">
         <w:r>
           <w:rPr>
             <w:rFonts w:ascii="Roboto" w:cs="Roboto" w:eastAsia="Roboto" w:hAnsi="Roboto"/>
@@ -74,7 +74,7 @@
         <w:spacing w:after="400"/>
         <w:jc w:val="right"/>
       </w:pPr>
-      <w:hyperlink w:history="1" r:id="rIdg9mlbe1c5ae96mcl4rzoa">
+      <w:hyperlink w:history="1" r:id="rId2nyitnsmszh4zt_qsnlwp">
         <w:r>
           <w:rPr>
             <w:rFonts w:ascii="Roboto" w:cs="Roboto" w:eastAsia="Roboto" w:hAnsi="Roboto"/>
@@ -1030,7 +1030,7 @@
         </w:rPr>
         <w:t xml:space="preserve"> and a </w:t>
       </w:r>
-      <w:hyperlink w:history="1" r:id="rIdoenzedb92mjozlg7tslsd">
+      <w:hyperlink w:history="1" r:id="rIdboyf5etuwyeohlr-uolci">
         <w:r>
           <w:rPr>
             <w:rFonts w:ascii="Roboto" w:cs="Roboto" w:eastAsia="Roboto" w:hAnsi="Roboto"/>
@@ -2367,7 +2367,7 @@
               </w:rPr>
               <w:t xml:space="preserve">See </w:t>
             </w:r>
-            <w:hyperlink w:history="1" r:id="rIdaif1ztdigy2ezar8qze72">
+            <w:hyperlink w:history="1" r:id="rIdn_nc5f-vk_jepmvnve4as">
               <w:r>
                 <w:rPr>
                   <w:rFonts w:ascii="Roboto" w:cs="Roboto" w:eastAsia="Roboto" w:hAnsi="Roboto"/>

</xml_diff>

<commit_message>
fix: escape HTML in code blocks so angle brackets survive PDF render
Raw code text was inserted into HTML unescaped, so `<...>` (e.g. SPARQL
IRIs) was parsed as an HTML tag by Puppeteer and dropped. Escape it in
both code() renderers; add regression tests. Bump version to 1.3.1.

Co-Authored-By: Claude Opus 4.8 <noreply@anthropic.com>
</commit_message>
<xml_diff>
--- a/test/output/fixture.docx
+++ b/test/output/fixture.docx
@@ -57,7 +57,7 @@
         </w:rPr>
         <w:t xml:space="preserve">	</w:t>
       </w:r>
-      <w:hyperlink w:history="1" r:id="rId3u3gsjovoukir3omgy-vz">
+      <w:hyperlink w:history="1" r:id="rIds_x3xajyraubnbuhob7eh">
         <w:r>
           <w:rPr>
             <w:rFonts w:ascii="Roboto" w:cs="Roboto" w:eastAsia="Roboto" w:hAnsi="Roboto"/>
@@ -74,7 +74,7 @@
         <w:spacing w:after="400"/>
         <w:jc w:val="right"/>
       </w:pPr>
-      <w:hyperlink w:history="1" r:id="rId2nyitnsmszh4zt_qsnlwp">
+      <w:hyperlink w:history="1" r:id="rIdh41jzztlgadu5rqbxxmwb">
         <w:r>
           <w:rPr>
             <w:rFonts w:ascii="Roboto" w:cs="Roboto" w:eastAsia="Roboto" w:hAnsi="Roboto"/>
@@ -1030,7 +1030,7 @@
         </w:rPr>
         <w:t xml:space="preserve"> and a </w:t>
       </w:r>
-      <w:hyperlink w:history="1" r:id="rIdboyf5etuwyeohlr-uolci">
+      <w:hyperlink w:history="1" r:id="rIdi0w3x0otpfewgnq6u6qcf">
         <w:r>
           <w:rPr>
             <w:rFonts w:ascii="Roboto" w:cs="Roboto" w:eastAsia="Roboto" w:hAnsi="Roboto"/>
@@ -2367,7 +2367,7 @@
               </w:rPr>
               <w:t xml:space="preserve">See </w:t>
             </w:r>
-            <w:hyperlink w:history="1" r:id="rIdn_nc5f-vk_jepmvnve4as">
+            <w:hyperlink w:history="1" r:id="rIdbbbabnv3canovxhwaplqu">
               <w:r>
                 <w:rPr>
                   <w:rFonts w:ascii="Roboto" w:cs="Roboto" w:eastAsia="Roboto" w:hAnsi="Roboto"/>

</xml_diff>

<commit_message>
test: exercise code-block angle brackets in fixture + assert survival
Broadens fixture.md with SPARQL/HTML-looking code and asserts the IRI
survives (XML-escaped) in the generated docx, so any future renderer
change that drops escaping fails the test.

Co-Authored-By: Claude Opus 4.8 <noreply@anthropic.com>
</commit_message>
<xml_diff>
--- a/test/output/fixture.docx
+++ b/test/output/fixture.docx
@@ -57,7 +57,7 @@
         </w:rPr>
         <w:t xml:space="preserve">	</w:t>
       </w:r>
-      <w:hyperlink w:history="1" r:id="rIds_x3xajyraubnbuhob7eh">
+      <w:hyperlink w:history="1" r:id="rIdbnijrryz78m1xpdfawh_2">
         <w:r>
           <w:rPr>
             <w:rFonts w:ascii="Roboto" w:cs="Roboto" w:eastAsia="Roboto" w:hAnsi="Roboto"/>
@@ -74,7 +74,7 @@
         <w:spacing w:after="400"/>
         <w:jc w:val="right"/>
       </w:pPr>
-      <w:hyperlink w:history="1" r:id="rIdh41jzztlgadu5rqbxxmwb">
+      <w:hyperlink w:history="1" r:id="rIdx7vb6xy0scpi1wm44cyaj">
         <w:r>
           <w:rPr>
             <w:rFonts w:ascii="Roboto" w:cs="Roboto" w:eastAsia="Roboto" w:hAnsi="Roboto"/>
@@ -1030,7 +1030,7 @@
         </w:rPr>
         <w:t xml:space="preserve"> and a </w:t>
       </w:r>
-      <w:hyperlink w:history="1" r:id="rIdi0w3x0otpfewgnq6u6qcf">
+      <w:hyperlink w:history="1" r:id="rIdkizexuwhklg1gv2siekhq">
         <w:r>
           <w:rPr>
             <w:rFonts w:ascii="Roboto" w:cs="Roboto" w:eastAsia="Roboto" w:hAnsi="Roboto"/>
@@ -1396,6 +1396,158 @@
       <w:pPr>
         <w:spacing w:after="120"/>
       </w:pPr>
+    </w:p>
+    <w:p>
+      <w:pPr>
+        <w:spacing w:after="120" w:line="360"/>
+      </w:pPr>
+      <w:r>
+        <w:rPr>
+          <w:rFonts w:ascii="Roboto" w:cs="Roboto" w:eastAsia="Roboto" w:hAnsi="Roboto"/>
+          <w:b w:val="false"/>
+          <w:bCs w:val="false"/>
+          <w:i w:val="false"/>
+          <w:iCs w:val="false"/>
+          <w:color w:val="353744"/>
+          <w:sz w:val="20"/>
+          <w:szCs w:val="20"/>
+        </w:rPr>
+        <w:t xml:space="preserve">Code with angle brackets and ampersands (must not be dropped as HTML):</w:t>
+      </w:r>
+    </w:p>
+    <w:tbl>
+      <w:tblPr>
+        <w:tblW w:type="pct" w:w="100%"/>
+        <w:tblBorders>
+          <w:top w:val="single" w:color="auto" w:sz="4"/>
+          <w:left w:val="single" w:color="auto" w:sz="4"/>
+          <w:bottom w:val="single" w:color="auto" w:sz="4"/>
+          <w:right w:val="single" w:color="auto" w:sz="4"/>
+          <w:insideH w:val="single" w:color="auto" w:sz="4"/>
+          <w:insideV w:val="single" w:color="auto" w:sz="4"/>
+        </w:tblBorders>
+      </w:tblPr>
+      <w:tblGrid>
+        <w:gridCol w:w="100"/>
+      </w:tblGrid>
+      <w:tr>
+        <w:tc>
+          <w:tcPr>
+            <w:tcBorders>
+              <w:top w:val="single" w:color="E0E0E0" w:sz="4"/>
+              <w:left w:val="single" w:color="058775" w:sz="6"/>
+              <w:bottom w:val="single" w:color="E0E0E0" w:sz="4"/>
+              <w:right w:val="single" w:color="E0E0E0" w:sz="4"/>
+            </w:tcBorders>
+            <w:shd w:fill="F5F5F5" w:val="clear"/>
+          </w:tcPr>
+          <w:p>
+            <w:pPr>
+              <w:spacing w:line="276"/>
+            </w:pPr>
+            <w:r>
+              <w:rPr>
+                <w:rFonts w:ascii="Roboto Mono" w:cs="Roboto Mono" w:eastAsia="Roboto Mono" w:hAnsi="Roboto Mono"/>
+                <w:color w:val="188038"/>
+                <w:sz w:val="17"/>
+                <w:szCs w:val="17"/>
+              </w:rPr>
+              <w:t xml:space="preserve">PREFIX eurio: &lt;http://data.europa.eu/s66#&gt;</w:t>
+            </w:r>
+          </w:p>
+          <w:p>
+            <w:pPr>
+              <w:spacing w:line="276"/>
+            </w:pPr>
+            <w:r>
+              <w:rPr>
+                <w:rFonts w:ascii="Roboto Mono" w:cs="Roboto Mono" w:eastAsia="Roboto Mono" w:hAnsi="Roboto Mono"/>
+                <w:color w:val="188038"/>
+                <w:sz w:val="17"/>
+                <w:szCs w:val="17"/>
+              </w:rPr>
+              <w:t xml:space="preserve">SELECT ?s WHERE { ?s a &lt;http://ex/#Thing&gt; . FILTER(?a &gt; 1 &amp;&amp; ?b &lt; 2) }</w:t>
+            </w:r>
+          </w:p>
+        </w:tc>
+      </w:tr>
+    </w:tbl>
+    <w:p>
+      <w:pPr>
+        <w:spacing w:after="120"/>
+      </w:pPr>
+    </w:p>
+    <w:p>
+      <w:pPr>
+        <w:spacing w:after="120" w:line="360"/>
+      </w:pPr>
+      <w:r>
+        <w:rPr>
+          <w:rFonts w:ascii="Roboto" w:cs="Roboto" w:eastAsia="Roboto" w:hAnsi="Roboto"/>
+          <w:b w:val="false"/>
+          <w:bCs w:val="false"/>
+          <w:i w:val="false"/>
+          <w:iCs w:val="false"/>
+          <w:color w:val="353744"/>
+          <w:sz w:val="20"/>
+          <w:szCs w:val="20"/>
+        </w:rPr>
+        <w:t xml:space="preserve">Inline code with brackets: </w:t>
+      </w:r>
+      <w:r>
+        <w:rPr>
+          <w:rFonts w:ascii="Roboto Mono" w:cs="Roboto Mono" w:eastAsia="Roboto Mono" w:hAnsi="Roboto Mono"/>
+          <w:b w:val="false"/>
+          <w:bCs w:val="false"/>
+          <w:i w:val="false"/>
+          <w:iCs w:val="false"/>
+          <w:color w:val="188038"/>
+          <w:sz w:val="18"/>
+          <w:szCs w:val="18"/>
+          <w:shd w:fill="F5F5F5" w:val="clear"/>
+        </w:rPr>
+        <w:t xml:space="preserve">&lt;html&gt;</w:t>
+      </w:r>
+      <w:r>
+        <w:rPr>
+          <w:rFonts w:ascii="Roboto" w:cs="Roboto" w:eastAsia="Roboto" w:hAnsi="Roboto"/>
+          <w:b w:val="false"/>
+          <w:bCs w:val="false"/>
+          <w:i w:val="false"/>
+          <w:iCs w:val="false"/>
+          <w:color w:val="353744"/>
+          <w:sz w:val="20"/>
+          <w:szCs w:val="20"/>
+        </w:rPr>
+        <w:t xml:space="preserve"> &amp; </w:t>
+      </w:r>
+      <w:r>
+        <w:rPr>
+          <w:rFonts w:ascii="Roboto Mono" w:cs="Roboto Mono" w:eastAsia="Roboto Mono" w:hAnsi="Roboto Mono"/>
+          <w:b w:val="false"/>
+          <w:bCs w:val="false"/>
+          <w:i w:val="false"/>
+          <w:iCs w:val="false"/>
+          <w:color w:val="188038"/>
+          <w:sz w:val="18"/>
+          <w:szCs w:val="18"/>
+          <w:shd w:fill="F5F5F5" w:val="clear"/>
+        </w:rPr>
+        <w:t xml:space="preserve">a &lt; b</w:t>
+      </w:r>
+      <w:r>
+        <w:rPr>
+          <w:rFonts w:ascii="Roboto" w:cs="Roboto" w:eastAsia="Roboto" w:hAnsi="Roboto"/>
+          <w:b w:val="false"/>
+          <w:bCs w:val="false"/>
+          <w:i w:val="false"/>
+          <w:iCs w:val="false"/>
+          <w:color w:val="353744"/>
+          <w:sz w:val="20"/>
+          <w:szCs w:val="20"/>
+        </w:rPr>
+        <w:t xml:space="preserve">.</w:t>
+      </w:r>
     </w:p>
     <w:p>
       <w:pPr>
@@ -2367,7 +2519,7 @@
               </w:rPr>
               <w:t xml:space="preserve">See </w:t>
             </w:r>
-            <w:hyperlink w:history="1" r:id="rIdbbbabnv3canovxhwaplqu">
+            <w:hyperlink w:history="1" r:id="rIdyfmqkqpm3ydcvtkbsxxfg">
               <w:r>
                 <w:rPr>
                   <w:rFonts w:ascii="Roboto" w:cs="Roboto" w:eastAsia="Roboto" w:hAnsi="Roboto"/>

</xml_diff>